<commit_message>
Empresa: análisis extenso con motor de cálculo y protocolo de huecos
- motor/calcular-empresa.mjs: DCF año a año con sensibilidades y DCF inverso,
  comparables con estadísticos y regresión, transacciones, suma de partes,
  síntesis de valoración, Altman Z / Piotroski F / Beneish M, puntuación de
  gobierno y controles de coherencia y de fuentes.
- Plantilla de 27 secciones en cinco partes, 28 gráficos nativos (síntesis
  de valoración en barras flotantes, segmentos apilados).
- Secciones y campos sin datos tras tres búsquedas no se imprimen; se listan
  en un anexo y, si son de núcleo, se avisa en el resumen.
- Prompt con protocolo por fases (30-60 min), mínimos verificables y
  revisión de comité; comando /analiza-empresa para Claude Code.

Co-Authored-By: Claude Opus 5.5 <noreply@anthropic.com>
</commit_message>
<xml_diff>
--- a/informes/ejemplo-etf.docx
+++ b/informes/ejemplo-etf.docx
@@ -14038,6 +14038,46 @@
       <w:color w:val="1F3A5F"/>
       <w:sz w:val="23"/>
       <w:szCs w:val="23"/>
+    </w:rPr>
+  </w:style>
+  <w:style w:type="paragraph" w:styleId="Parte">
+    <w:name w:val="Parte"/>
+    <w:basedOn w:val="Normal"/>
+    <w:next w:val="Normal"/>
+    <w:pPr>
+      <w:keepNext/>
+      <w:pBdr>
+        <w:bottom w:val="single" w:color="2A78D6" w:sz="12" w:space="6"/>
+      </w:pBdr>
+      <w:spacing w:after="400" w:before="2400"/>
+      <w:outlineLvl w:val="0"/>
+    </w:pPr>
+    <w:rPr>
+      <w:rFonts w:ascii="Calibri" w:cs="Calibri" w:eastAsia="Calibri" w:hAnsi="Calibri"/>
+      <w:b/>
+      <w:bCs/>
+      <w:color w:val="2A78D6"/>
+      <w:sz w:val="40"/>
+      <w:szCs w:val="40"/>
+    </w:rPr>
+  </w:style>
+  <w:style w:type="paragraph" w:styleId="Aviso">
+    <w:name w:val="Aviso"/>
+    <w:basedOn w:val="Normal"/>
+    <w:next w:val="Normal"/>
+    <w:pPr>
+      <w:pBdr>
+        <w:left w:val="single" w:color="D9772E" w:sz="24" w:space="8"/>
+      </w:pBdr>
+      <w:spacing w:after="200" w:before="120"/>
+      <w:ind w:left="200"/>
+    </w:pPr>
+    <w:rPr>
+      <w:b/>
+      <w:bCs/>
+      <w:color w:val="A3470F"/>
+      <w:sz w:val="19"/>
+      <w:szCs w:val="19"/>
     </w:rPr>
   </w:style>
   <w:style w:type="paragraph" w:styleId="Confianza">

</xml_diff>

<commit_message>
Empresa, vuelta 2 (Indra): deuda ajustada, perímetro, gobierno y escenarios
- Deuda neta ajustada (con pensiones y otros_ajustes) en portada, datos clave y deuda.
- Cambios de perímetro: campo financieros.cambios_perimetro y detección de saltos de
  activo; Beneish no interpretable y nota en balance ese año.
- Gobierno con 12 criterios: estabilidad de la cúpula (24 meses), accionista_control,
  voto en contra en lugar de a favor.
- dcf.anios[].fijo: el año en curso no se mueve en escenarios, sensibilidades ni DCF inverso.
- Control de coherencia LTM/NTM de comparables; control de deuda del puente solo
  con el mismo cierre; detalles de controles con coma decimal y sin alarma en OK.
- Tablas cortas no se parten entre páginas (keepNext al rellenar).
- Prompt: anticipos y prefinanciación, cambios de segmentación, cuota con varios
  mercados, LTM pro forma, mismo proveedor en LTM/NTM, WebFetch literal.

Co-Authored-By: Claude Opus 5.5 <noreply@anthropic.com>
</commit_message>
<xml_diff>
--- a/informes/ejemplo-etf.docx
+++ b/informes/ejemplo-etf.docx
@@ -2285,6 +2285,7 @@
           </w:tcPr>
           <w:p>
             <w:pPr>
+              <w:keepNext/>
               <w:spacing w:after="0" w:before="0"/>
               <w:jc w:val="left"/>
             </w:pPr>
@@ -2320,6 +2321,7 @@
           </w:tcPr>
           <w:p>
             <w:pPr>
+              <w:keepNext/>
               <w:spacing w:after="0" w:before="0"/>
               <w:jc w:val="right"/>
             </w:pPr>
@@ -2355,6 +2357,7 @@
           </w:tcPr>
           <w:p>
             <w:pPr>
+              <w:keepNext/>
               <w:spacing w:after="0" w:before="0"/>
               <w:jc w:val="left"/>
             </w:pPr>
@@ -2394,6 +2397,7 @@
           </w:tcPr>
           <w:p>
             <w:pPr>
+              <w:keepNext/>
               <w:spacing w:after="0" w:before="0"/>
               <w:jc w:val="left"/>
             </w:pPr>
@@ -2428,6 +2432,7 @@
           </w:tcPr>
           <w:p>
             <w:pPr>
+              <w:keepNext/>
               <w:spacing w:after="0" w:before="0"/>
               <w:jc w:val="right"/>
             </w:pPr>
@@ -2462,6 +2467,7 @@
           </w:tcPr>
           <w:p>
             <w:pPr>
+              <w:keepNext/>
               <w:spacing w:after="0" w:before="0"/>
               <w:jc w:val="left"/>
             </w:pPr>
@@ -2501,6 +2507,7 @@
           </w:tcPr>
           <w:p>
             <w:pPr>
+              <w:keepNext/>
               <w:spacing w:after="0" w:before="0"/>
               <w:jc w:val="left"/>
             </w:pPr>
@@ -2535,6 +2542,7 @@
           </w:tcPr>
           <w:p>
             <w:pPr>
+              <w:keepNext/>
               <w:spacing w:after="0" w:before="0"/>
               <w:jc w:val="right"/>
             </w:pPr>
@@ -2569,6 +2577,7 @@
           </w:tcPr>
           <w:p>
             <w:pPr>
+              <w:keepNext/>
               <w:spacing w:after="0" w:before="0"/>
               <w:jc w:val="left"/>
             </w:pPr>
@@ -2608,6 +2617,7 @@
           </w:tcPr>
           <w:p>
             <w:pPr>
+              <w:keepNext/>
               <w:spacing w:after="0" w:before="0"/>
               <w:jc w:val="left"/>
             </w:pPr>
@@ -2642,6 +2652,7 @@
           </w:tcPr>
           <w:p>
             <w:pPr>
+              <w:keepNext/>
               <w:spacing w:after="0" w:before="0"/>
               <w:jc w:val="right"/>
             </w:pPr>
@@ -2676,6 +2687,7 @@
           </w:tcPr>
           <w:p>
             <w:pPr>
+              <w:keepNext/>
               <w:spacing w:after="0" w:before="0"/>
               <w:jc w:val="left"/>
             </w:pPr>
@@ -2715,6 +2727,7 @@
           </w:tcPr>
           <w:p>
             <w:pPr>
+              <w:keepNext/>
               <w:spacing w:after="0" w:before="0"/>
               <w:jc w:val="left"/>
             </w:pPr>
@@ -2749,6 +2762,7 @@
           </w:tcPr>
           <w:p>
             <w:pPr>
+              <w:keepNext/>
               <w:spacing w:after="0" w:before="0"/>
               <w:jc w:val="right"/>
             </w:pPr>
@@ -2783,6 +2797,7 @@
           </w:tcPr>
           <w:p>
             <w:pPr>
+              <w:keepNext/>
               <w:spacing w:after="0" w:before="0"/>
               <w:jc w:val="left"/>
             </w:pPr>
@@ -3488,6 +3503,7 @@
           </w:tcPr>
           <w:p>
             <w:pPr>
+              <w:keepNext/>
               <w:spacing w:after="0" w:before="0"/>
               <w:jc w:val="left"/>
             </w:pPr>
@@ -3523,6 +3539,7 @@
           </w:tcPr>
           <w:p>
             <w:pPr>
+              <w:keepNext/>
               <w:spacing w:after="0" w:before="0"/>
               <w:jc w:val="right"/>
             </w:pPr>
@@ -3558,6 +3575,7 @@
           </w:tcPr>
           <w:p>
             <w:pPr>
+              <w:keepNext/>
               <w:spacing w:after="0" w:before="0"/>
               <w:jc w:val="right"/>
             </w:pPr>
@@ -3593,6 +3611,7 @@
           </w:tcPr>
           <w:p>
             <w:pPr>
+              <w:keepNext/>
               <w:spacing w:after="0" w:before="0"/>
               <w:jc w:val="right"/>
             </w:pPr>
@@ -3632,6 +3651,7 @@
           </w:tcPr>
           <w:p>
             <w:pPr>
+              <w:keepNext/>
               <w:spacing w:after="0" w:before="0"/>
               <w:jc w:val="left"/>
             </w:pPr>
@@ -3666,6 +3686,7 @@
           </w:tcPr>
           <w:p>
             <w:pPr>
+              <w:keepNext/>
               <w:spacing w:after="0" w:before="0"/>
               <w:jc w:val="right"/>
             </w:pPr>
@@ -3700,6 +3721,7 @@
           </w:tcPr>
           <w:p>
             <w:pPr>
+              <w:keepNext/>
               <w:spacing w:after="0" w:before="0"/>
               <w:jc w:val="right"/>
             </w:pPr>
@@ -3734,6 +3756,7 @@
           </w:tcPr>
           <w:p>
             <w:pPr>
+              <w:keepNext/>
               <w:spacing w:after="0" w:before="0"/>
               <w:jc w:val="right"/>
             </w:pPr>
@@ -3773,6 +3796,7 @@
           </w:tcPr>
           <w:p>
             <w:pPr>
+              <w:keepNext/>
               <w:spacing w:after="0" w:before="0"/>
               <w:jc w:val="left"/>
             </w:pPr>
@@ -3807,6 +3831,7 @@
           </w:tcPr>
           <w:p>
             <w:pPr>
+              <w:keepNext/>
               <w:spacing w:after="0" w:before="0"/>
               <w:jc w:val="right"/>
             </w:pPr>
@@ -3841,6 +3866,7 @@
           </w:tcPr>
           <w:p>
             <w:pPr>
+              <w:keepNext/>
               <w:spacing w:after="0" w:before="0"/>
               <w:jc w:val="right"/>
             </w:pPr>
@@ -3875,6 +3901,7 @@
           </w:tcPr>
           <w:p>
             <w:pPr>
+              <w:keepNext/>
               <w:spacing w:after="0" w:before="0"/>
               <w:jc w:val="right"/>
             </w:pPr>
@@ -3914,6 +3941,7 @@
           </w:tcPr>
           <w:p>
             <w:pPr>
+              <w:keepNext/>
               <w:spacing w:after="0" w:before="0"/>
               <w:jc w:val="left"/>
             </w:pPr>
@@ -3948,6 +3976,7 @@
           </w:tcPr>
           <w:p>
             <w:pPr>
+              <w:keepNext/>
               <w:spacing w:after="0" w:before="0"/>
               <w:jc w:val="right"/>
             </w:pPr>
@@ -3982,6 +4011,7 @@
           </w:tcPr>
           <w:p>
             <w:pPr>
+              <w:keepNext/>
               <w:spacing w:after="0" w:before="0"/>
               <w:jc w:val="right"/>
             </w:pPr>
@@ -4016,6 +4046,7 @@
           </w:tcPr>
           <w:p>
             <w:pPr>
+              <w:keepNext/>
               <w:spacing w:after="0" w:before="0"/>
               <w:jc w:val="right"/>
             </w:pPr>
@@ -4055,6 +4086,7 @@
           </w:tcPr>
           <w:p>
             <w:pPr>
+              <w:keepNext/>
               <w:spacing w:after="0" w:before="0"/>
               <w:jc w:val="left"/>
             </w:pPr>
@@ -4089,6 +4121,7 @@
           </w:tcPr>
           <w:p>
             <w:pPr>
+              <w:keepNext/>
               <w:spacing w:after="0" w:before="0"/>
               <w:jc w:val="right"/>
             </w:pPr>
@@ -4123,6 +4156,7 @@
           </w:tcPr>
           <w:p>
             <w:pPr>
+              <w:keepNext/>
               <w:spacing w:after="0" w:before="0"/>
               <w:jc w:val="right"/>
             </w:pPr>
@@ -4157,6 +4191,7 @@
           </w:tcPr>
           <w:p>
             <w:pPr>
+              <w:keepNext/>
               <w:spacing w:after="0" w:before="0"/>
               <w:jc w:val="right"/>
             </w:pPr>
@@ -4896,6 +4931,7 @@
           </w:tcPr>
           <w:p>
             <w:pPr>
+              <w:keepNext/>
               <w:spacing w:after="0" w:before="0"/>
               <w:jc w:val="center"/>
             </w:pPr>
@@ -4931,6 +4967,7 @@
           </w:tcPr>
           <w:p>
             <w:pPr>
+              <w:keepNext/>
               <w:spacing w:after="0" w:before="0"/>
               <w:jc w:val="left"/>
             </w:pPr>
@@ -4966,6 +5003,7 @@
           </w:tcPr>
           <w:p>
             <w:pPr>
+              <w:keepNext/>
               <w:spacing w:after="0" w:before="0"/>
               <w:jc w:val="right"/>
             </w:pPr>
@@ -5001,6 +5039,7 @@
           </w:tcPr>
           <w:p>
             <w:pPr>
+              <w:keepNext/>
               <w:spacing w:after="0" w:before="0"/>
               <w:jc w:val="left"/>
             </w:pPr>
@@ -5036,6 +5075,7 @@
           </w:tcPr>
           <w:p>
             <w:pPr>
+              <w:keepNext/>
               <w:spacing w:after="0" w:before="0"/>
               <w:jc w:val="left"/>
             </w:pPr>
@@ -5075,6 +5115,7 @@
           </w:tcPr>
           <w:p>
             <w:pPr>
+              <w:keepNext/>
               <w:spacing w:after="0" w:before="0"/>
               <w:jc w:val="center"/>
             </w:pPr>
@@ -5109,6 +5150,7 @@
           </w:tcPr>
           <w:p>
             <w:pPr>
+              <w:keepNext/>
               <w:spacing w:after="0" w:before="0"/>
               <w:jc w:val="left"/>
             </w:pPr>
@@ -5143,6 +5185,7 @@
           </w:tcPr>
           <w:p>
             <w:pPr>
+              <w:keepNext/>
               <w:spacing w:after="0" w:before="0"/>
               <w:jc w:val="right"/>
             </w:pPr>
@@ -5177,6 +5220,7 @@
           </w:tcPr>
           <w:p>
             <w:pPr>
+              <w:keepNext/>
               <w:spacing w:after="0" w:before="0"/>
               <w:jc w:val="left"/>
             </w:pPr>
@@ -5211,6 +5255,7 @@
           </w:tcPr>
           <w:p>
             <w:pPr>
+              <w:keepNext/>
               <w:spacing w:after="0" w:before="0"/>
               <w:jc w:val="left"/>
             </w:pPr>
@@ -5250,6 +5295,7 @@
           </w:tcPr>
           <w:p>
             <w:pPr>
+              <w:keepNext/>
               <w:spacing w:after="0" w:before="0"/>
               <w:jc w:val="center"/>
             </w:pPr>
@@ -5284,6 +5330,7 @@
           </w:tcPr>
           <w:p>
             <w:pPr>
+              <w:keepNext/>
               <w:spacing w:after="0" w:before="0"/>
               <w:jc w:val="left"/>
             </w:pPr>
@@ -5318,6 +5365,7 @@
           </w:tcPr>
           <w:p>
             <w:pPr>
+              <w:keepNext/>
               <w:spacing w:after="0" w:before="0"/>
               <w:jc w:val="right"/>
             </w:pPr>
@@ -5352,6 +5400,7 @@
           </w:tcPr>
           <w:p>
             <w:pPr>
+              <w:keepNext/>
               <w:spacing w:after="0" w:before="0"/>
               <w:jc w:val="left"/>
             </w:pPr>
@@ -5386,6 +5435,7 @@
           </w:tcPr>
           <w:p>
             <w:pPr>
+              <w:keepNext/>
               <w:spacing w:after="0" w:before="0"/>
               <w:jc w:val="left"/>
             </w:pPr>
@@ -5425,6 +5475,7 @@
           </w:tcPr>
           <w:p>
             <w:pPr>
+              <w:keepNext/>
               <w:spacing w:after="0" w:before="0"/>
               <w:jc w:val="center"/>
             </w:pPr>
@@ -5459,6 +5510,7 @@
           </w:tcPr>
           <w:p>
             <w:pPr>
+              <w:keepNext/>
               <w:spacing w:after="0" w:before="0"/>
               <w:jc w:val="left"/>
             </w:pPr>
@@ -5493,6 +5545,7 @@
           </w:tcPr>
           <w:p>
             <w:pPr>
+              <w:keepNext/>
               <w:spacing w:after="0" w:before="0"/>
               <w:jc w:val="right"/>
             </w:pPr>
@@ -5527,6 +5580,7 @@
           </w:tcPr>
           <w:p>
             <w:pPr>
+              <w:keepNext/>
               <w:spacing w:after="0" w:before="0"/>
               <w:jc w:val="left"/>
             </w:pPr>
@@ -5561,6 +5615,7 @@
           </w:tcPr>
           <w:p>
             <w:pPr>
+              <w:keepNext/>
               <w:spacing w:after="0" w:before="0"/>
               <w:jc w:val="left"/>
             </w:pPr>
@@ -5600,6 +5655,7 @@
           </w:tcPr>
           <w:p>
             <w:pPr>
+              <w:keepNext/>
               <w:spacing w:after="0" w:before="0"/>
               <w:jc w:val="center"/>
             </w:pPr>
@@ -5634,6 +5690,7 @@
           </w:tcPr>
           <w:p>
             <w:pPr>
+              <w:keepNext/>
               <w:spacing w:after="0" w:before="0"/>
               <w:jc w:val="left"/>
             </w:pPr>
@@ -5668,6 +5725,7 @@
           </w:tcPr>
           <w:p>
             <w:pPr>
+              <w:keepNext/>
               <w:spacing w:after="0" w:before="0"/>
               <w:jc w:val="right"/>
             </w:pPr>
@@ -5702,6 +5760,7 @@
           </w:tcPr>
           <w:p>
             <w:pPr>
+              <w:keepNext/>
               <w:spacing w:after="0" w:before="0"/>
               <w:jc w:val="left"/>
             </w:pPr>
@@ -5736,6 +5795,7 @@
           </w:tcPr>
           <w:p>
             <w:pPr>
+              <w:keepNext/>
               <w:spacing w:after="0" w:before="0"/>
               <w:jc w:val="left"/>
             </w:pPr>
@@ -5775,6 +5835,7 @@
           </w:tcPr>
           <w:p>
             <w:pPr>
+              <w:keepNext/>
               <w:spacing w:after="0" w:before="0"/>
               <w:jc w:val="center"/>
             </w:pPr>
@@ -5809,6 +5870,7 @@
           </w:tcPr>
           <w:p>
             <w:pPr>
+              <w:keepNext/>
               <w:spacing w:after="0" w:before="0"/>
               <w:jc w:val="left"/>
             </w:pPr>
@@ -5843,6 +5905,7 @@
           </w:tcPr>
           <w:p>
             <w:pPr>
+              <w:keepNext/>
               <w:spacing w:after="0" w:before="0"/>
               <w:jc w:val="right"/>
             </w:pPr>
@@ -5877,6 +5940,7 @@
           </w:tcPr>
           <w:p>
             <w:pPr>
+              <w:keepNext/>
               <w:spacing w:after="0" w:before="0"/>
               <w:jc w:val="left"/>
             </w:pPr>
@@ -5911,6 +5975,7 @@
           </w:tcPr>
           <w:p>
             <w:pPr>
+              <w:keepNext/>
               <w:spacing w:after="0" w:before="0"/>
               <w:jc w:val="left"/>
             </w:pPr>
@@ -5950,6 +6015,7 @@
           </w:tcPr>
           <w:p>
             <w:pPr>
+              <w:keepNext/>
               <w:spacing w:after="0" w:before="0"/>
               <w:jc w:val="center"/>
             </w:pPr>
@@ -5984,6 +6050,7 @@
           </w:tcPr>
           <w:p>
             <w:pPr>
+              <w:keepNext/>
               <w:spacing w:after="0" w:before="0"/>
               <w:jc w:val="left"/>
             </w:pPr>
@@ -6018,6 +6085,7 @@
           </w:tcPr>
           <w:p>
             <w:pPr>
+              <w:keepNext/>
               <w:spacing w:after="0" w:before="0"/>
               <w:jc w:val="right"/>
             </w:pPr>
@@ -6052,6 +6120,7 @@
           </w:tcPr>
           <w:p>
             <w:pPr>
+              <w:keepNext/>
               <w:spacing w:after="0" w:before="0"/>
               <w:jc w:val="left"/>
             </w:pPr>
@@ -6086,6 +6155,7 @@
           </w:tcPr>
           <w:p>
             <w:pPr>
+              <w:keepNext/>
               <w:spacing w:after="0" w:before="0"/>
               <w:jc w:val="left"/>
             </w:pPr>
@@ -6125,6 +6195,7 @@
           </w:tcPr>
           <w:p>
             <w:pPr>
+              <w:keepNext/>
               <w:spacing w:after="0" w:before="0"/>
               <w:jc w:val="center"/>
             </w:pPr>
@@ -6159,6 +6230,7 @@
           </w:tcPr>
           <w:p>
             <w:pPr>
+              <w:keepNext/>
               <w:spacing w:after="0" w:before="0"/>
               <w:jc w:val="left"/>
             </w:pPr>
@@ -6193,6 +6265,7 @@
           </w:tcPr>
           <w:p>
             <w:pPr>
+              <w:keepNext/>
               <w:spacing w:after="0" w:before="0"/>
               <w:jc w:val="right"/>
             </w:pPr>
@@ -6227,6 +6300,7 @@
           </w:tcPr>
           <w:p>
             <w:pPr>
+              <w:keepNext/>
               <w:spacing w:after="0" w:before="0"/>
               <w:jc w:val="left"/>
             </w:pPr>
@@ -6261,6 +6335,7 @@
           </w:tcPr>
           <w:p>
             <w:pPr>
+              <w:keepNext/>
               <w:spacing w:after="0" w:before="0"/>
               <w:jc w:val="left"/>
             </w:pPr>
@@ -6300,6 +6375,7 @@
           </w:tcPr>
           <w:p>
             <w:pPr>
+              <w:keepNext/>
               <w:spacing w:after="0" w:before="0"/>
               <w:jc w:val="center"/>
             </w:pPr>
@@ -6334,6 +6410,7 @@
           </w:tcPr>
           <w:p>
             <w:pPr>
+              <w:keepNext/>
               <w:spacing w:after="0" w:before="0"/>
               <w:jc w:val="left"/>
             </w:pPr>
@@ -6368,6 +6445,7 @@
           </w:tcPr>
           <w:p>
             <w:pPr>
+              <w:keepNext/>
               <w:spacing w:after="0" w:before="0"/>
               <w:jc w:val="right"/>
             </w:pPr>
@@ -6402,6 +6480,7 @@
           </w:tcPr>
           <w:p>
             <w:pPr>
+              <w:keepNext/>
               <w:spacing w:after="0" w:before="0"/>
               <w:jc w:val="left"/>
             </w:pPr>
@@ -6436,6 +6515,7 @@
           </w:tcPr>
           <w:p>
             <w:pPr>
+              <w:keepNext/>
               <w:spacing w:after="0" w:before="0"/>
               <w:jc w:val="left"/>
             </w:pPr>
@@ -6475,6 +6555,7 @@
           </w:tcPr>
           <w:p>
             <w:pPr>
+              <w:keepNext/>
               <w:spacing w:after="0" w:before="0"/>
               <w:jc w:val="center"/>
             </w:pPr>
@@ -6509,6 +6590,7 @@
           </w:tcPr>
           <w:p>
             <w:pPr>
+              <w:keepNext/>
               <w:spacing w:after="0" w:before="0"/>
               <w:jc w:val="left"/>
             </w:pPr>
@@ -6543,6 +6625,7 @@
           </w:tcPr>
           <w:p>
             <w:pPr>
+              <w:keepNext/>
               <w:spacing w:after="0" w:before="0"/>
               <w:jc w:val="right"/>
             </w:pPr>
@@ -6577,6 +6660,7 @@
           </w:tcPr>
           <w:p>
             <w:pPr>
+              <w:keepNext/>
               <w:spacing w:after="0" w:before="0"/>
               <w:jc w:val="left"/>
             </w:pPr>
@@ -6611,6 +6695,7 @@
           </w:tcPr>
           <w:p>
             <w:pPr>
+              <w:keepNext/>
               <w:spacing w:after="0" w:before="0"/>
               <w:jc w:val="left"/>
             </w:pPr>
@@ -7011,6 +7096,7 @@
           </w:tcPr>
           <w:p>
             <w:pPr>
+              <w:keepNext/>
               <w:spacing w:after="0" w:before="0"/>
               <w:jc w:val="left"/>
             </w:pPr>
@@ -7046,6 +7132,7 @@
           </w:tcPr>
           <w:p>
             <w:pPr>
+              <w:keepNext/>
               <w:spacing w:after="0" w:before="0"/>
               <w:jc w:val="right"/>
             </w:pPr>
@@ -7081,6 +7168,7 @@
           </w:tcPr>
           <w:p>
             <w:pPr>
+              <w:keepNext/>
               <w:spacing w:after="0" w:before="0"/>
               <w:jc w:val="right"/>
             </w:pPr>
@@ -7116,6 +7204,7 @@
           </w:tcPr>
           <w:p>
             <w:pPr>
+              <w:keepNext/>
               <w:spacing w:after="0" w:before="0"/>
               <w:jc w:val="left"/>
             </w:pPr>
@@ -7155,6 +7244,7 @@
           </w:tcPr>
           <w:p>
             <w:pPr>
+              <w:keepNext/>
               <w:spacing w:after="0" w:before="0"/>
               <w:jc w:val="left"/>
             </w:pPr>
@@ -7189,6 +7279,7 @@
           </w:tcPr>
           <w:p>
             <w:pPr>
+              <w:keepNext/>
               <w:spacing w:after="0" w:before="0"/>
               <w:jc w:val="right"/>
             </w:pPr>
@@ -7223,6 +7314,7 @@
           </w:tcPr>
           <w:p>
             <w:pPr>
+              <w:keepNext/>
               <w:spacing w:after="0" w:before="0"/>
               <w:jc w:val="right"/>
             </w:pPr>
@@ -7257,6 +7349,7 @@
           </w:tcPr>
           <w:p>
             <w:pPr>
+              <w:keepNext/>
               <w:spacing w:after="0" w:before="0"/>
               <w:jc w:val="left"/>
             </w:pPr>
@@ -7296,6 +7389,7 @@
           </w:tcPr>
           <w:p>
             <w:pPr>
+              <w:keepNext/>
               <w:spacing w:after="0" w:before="0"/>
               <w:jc w:val="left"/>
             </w:pPr>
@@ -7330,6 +7424,7 @@
           </w:tcPr>
           <w:p>
             <w:pPr>
+              <w:keepNext/>
               <w:spacing w:after="0" w:before="0"/>
               <w:jc w:val="right"/>
             </w:pPr>
@@ -7364,6 +7459,7 @@
           </w:tcPr>
           <w:p>
             <w:pPr>
+              <w:keepNext/>
               <w:spacing w:after="0" w:before="0"/>
               <w:jc w:val="right"/>
             </w:pPr>
@@ -7398,6 +7494,7 @@
           </w:tcPr>
           <w:p>
             <w:pPr>
+              <w:keepNext/>
               <w:spacing w:after="0" w:before="0"/>
               <w:jc w:val="left"/>
             </w:pPr>
@@ -7437,6 +7534,7 @@
           </w:tcPr>
           <w:p>
             <w:pPr>
+              <w:keepNext/>
               <w:spacing w:after="0" w:before="0"/>
               <w:jc w:val="left"/>
             </w:pPr>
@@ -7471,6 +7569,7 @@
           </w:tcPr>
           <w:p>
             <w:pPr>
+              <w:keepNext/>
               <w:spacing w:after="0" w:before="0"/>
               <w:jc w:val="right"/>
             </w:pPr>
@@ -7505,6 +7604,7 @@
           </w:tcPr>
           <w:p>
             <w:pPr>
+              <w:keepNext/>
               <w:spacing w:after="0" w:before="0"/>
               <w:jc w:val="right"/>
             </w:pPr>
@@ -7539,6 +7639,7 @@
           </w:tcPr>
           <w:p>
             <w:pPr>
+              <w:keepNext/>
               <w:spacing w:after="0" w:before="0"/>
               <w:jc w:val="left"/>
             </w:pPr>
@@ -7770,6 +7871,7 @@
           </w:tcPr>
           <w:p>
             <w:pPr>
+              <w:keepNext/>
               <w:spacing w:after="0" w:before="0"/>
               <w:jc w:val="left"/>
             </w:pPr>
@@ -7805,6 +7907,7 @@
           </w:tcPr>
           <w:p>
             <w:pPr>
+              <w:keepNext/>
               <w:spacing w:after="0" w:before="0"/>
               <w:jc w:val="right"/>
             </w:pPr>
@@ -7840,6 +7943,7 @@
           </w:tcPr>
           <w:p>
             <w:pPr>
+              <w:keepNext/>
               <w:spacing w:after="0" w:before="0"/>
               <w:jc w:val="right"/>
             </w:pPr>
@@ -7875,6 +7979,7 @@
           </w:tcPr>
           <w:p>
             <w:pPr>
+              <w:keepNext/>
               <w:spacing w:after="0" w:before="0"/>
               <w:jc w:val="right"/>
             </w:pPr>
@@ -7914,6 +8019,7 @@
           </w:tcPr>
           <w:p>
             <w:pPr>
+              <w:keepNext/>
               <w:spacing w:after="0" w:before="0"/>
               <w:jc w:val="left"/>
             </w:pPr>
@@ -7948,6 +8054,7 @@
           </w:tcPr>
           <w:p>
             <w:pPr>
+              <w:keepNext/>
               <w:spacing w:after="0" w:before="0"/>
               <w:jc w:val="right"/>
             </w:pPr>
@@ -7982,6 +8089,7 @@
           </w:tcPr>
           <w:p>
             <w:pPr>
+              <w:keepNext/>
               <w:spacing w:after="0" w:before="0"/>
               <w:jc w:val="right"/>
             </w:pPr>
@@ -8016,6 +8124,7 @@
           </w:tcPr>
           <w:p>
             <w:pPr>
+              <w:keepNext/>
               <w:spacing w:after="0" w:before="0"/>
               <w:jc w:val="right"/>
             </w:pPr>
@@ -8055,6 +8164,7 @@
           </w:tcPr>
           <w:p>
             <w:pPr>
+              <w:keepNext/>
               <w:spacing w:after="0" w:before="0"/>
               <w:jc w:val="left"/>
             </w:pPr>
@@ -8089,6 +8199,7 @@
           </w:tcPr>
           <w:p>
             <w:pPr>
+              <w:keepNext/>
               <w:spacing w:after="0" w:before="0"/>
               <w:jc w:val="right"/>
             </w:pPr>
@@ -8123,6 +8234,7 @@
           </w:tcPr>
           <w:p>
             <w:pPr>
+              <w:keepNext/>
               <w:spacing w:after="0" w:before="0"/>
               <w:jc w:val="right"/>
             </w:pPr>
@@ -8157,6 +8269,7 @@
           </w:tcPr>
           <w:p>
             <w:pPr>
+              <w:keepNext/>
               <w:spacing w:after="0" w:before="0"/>
               <w:jc w:val="right"/>
             </w:pPr>
@@ -8196,6 +8309,7 @@
           </w:tcPr>
           <w:p>
             <w:pPr>
+              <w:keepNext/>
               <w:spacing w:after="0" w:before="0"/>
               <w:jc w:val="left"/>
             </w:pPr>
@@ -8230,6 +8344,7 @@
           </w:tcPr>
           <w:p>
             <w:pPr>
+              <w:keepNext/>
               <w:spacing w:after="0" w:before="0"/>
               <w:jc w:val="right"/>
             </w:pPr>
@@ -8264,6 +8379,7 @@
           </w:tcPr>
           <w:p>
             <w:pPr>
+              <w:keepNext/>
               <w:spacing w:after="0" w:before="0"/>
               <w:jc w:val="right"/>
             </w:pPr>
@@ -8298,6 +8414,7 @@
           </w:tcPr>
           <w:p>
             <w:pPr>
+              <w:keepNext/>
               <w:spacing w:after="0" w:before="0"/>
               <w:jc w:val="right"/>
             </w:pPr>
@@ -8337,6 +8454,7 @@
           </w:tcPr>
           <w:p>
             <w:pPr>
+              <w:keepNext/>
               <w:spacing w:after="0" w:before="0"/>
               <w:jc w:val="left"/>
             </w:pPr>
@@ -8371,6 +8489,7 @@
           </w:tcPr>
           <w:p>
             <w:pPr>
+              <w:keepNext/>
               <w:spacing w:after="0" w:before="0"/>
               <w:jc w:val="right"/>
             </w:pPr>
@@ -8405,6 +8524,7 @@
           </w:tcPr>
           <w:p>
             <w:pPr>
+              <w:keepNext/>
               <w:spacing w:after="0" w:before="0"/>
               <w:jc w:val="right"/>
             </w:pPr>
@@ -8439,6 +8559,7 @@
           </w:tcPr>
           <w:p>
             <w:pPr>
+              <w:keepNext/>
               <w:spacing w:after="0" w:before="0"/>
               <w:jc w:val="right"/>
             </w:pPr>
@@ -8667,6 +8788,7 @@
           </w:tcPr>
           <w:p>
             <w:pPr>
+              <w:keepNext/>
               <w:spacing w:after="0" w:before="0"/>
               <w:jc w:val="left"/>
             </w:pPr>
@@ -8702,6 +8824,7 @@
           </w:tcPr>
           <w:p>
             <w:pPr>
+              <w:keepNext/>
               <w:spacing w:after="0" w:before="0"/>
               <w:jc w:val="right"/>
             </w:pPr>
@@ -8737,6 +8860,7 @@
           </w:tcPr>
           <w:p>
             <w:pPr>
+              <w:keepNext/>
               <w:spacing w:after="0" w:before="0"/>
               <w:jc w:val="right"/>
             </w:pPr>
@@ -8772,6 +8896,7 @@
           </w:tcPr>
           <w:p>
             <w:pPr>
+              <w:keepNext/>
               <w:spacing w:after="0" w:before="0"/>
               <w:jc w:val="right"/>
             </w:pPr>
@@ -8811,6 +8936,7 @@
           </w:tcPr>
           <w:p>
             <w:pPr>
+              <w:keepNext/>
               <w:spacing w:after="0" w:before="0"/>
               <w:jc w:val="left"/>
             </w:pPr>
@@ -8845,6 +8971,7 @@
           </w:tcPr>
           <w:p>
             <w:pPr>
+              <w:keepNext/>
               <w:spacing w:after="0" w:before="0"/>
               <w:jc w:val="right"/>
             </w:pPr>
@@ -8879,6 +9006,7 @@
           </w:tcPr>
           <w:p>
             <w:pPr>
+              <w:keepNext/>
               <w:spacing w:after="0" w:before="0"/>
               <w:jc w:val="right"/>
             </w:pPr>
@@ -8913,6 +9041,7 @@
           </w:tcPr>
           <w:p>
             <w:pPr>
+              <w:keepNext/>
               <w:spacing w:after="0" w:before="0"/>
               <w:jc w:val="right"/>
             </w:pPr>
@@ -8952,6 +9081,7 @@
           </w:tcPr>
           <w:p>
             <w:pPr>
+              <w:keepNext/>
               <w:spacing w:after="0" w:before="0"/>
               <w:jc w:val="left"/>
             </w:pPr>
@@ -8986,6 +9116,7 @@
           </w:tcPr>
           <w:p>
             <w:pPr>
+              <w:keepNext/>
               <w:spacing w:after="0" w:before="0"/>
               <w:jc w:val="right"/>
             </w:pPr>
@@ -9020,6 +9151,7 @@
           </w:tcPr>
           <w:p>
             <w:pPr>
+              <w:keepNext/>
               <w:spacing w:after="0" w:before="0"/>
               <w:jc w:val="right"/>
             </w:pPr>
@@ -9054,6 +9186,7 @@
           </w:tcPr>
           <w:p>
             <w:pPr>
+              <w:keepNext/>
               <w:spacing w:after="0" w:before="0"/>
               <w:jc w:val="right"/>
             </w:pPr>
@@ -9093,6 +9226,7 @@
           </w:tcPr>
           <w:p>
             <w:pPr>
+              <w:keepNext/>
               <w:spacing w:after="0" w:before="0"/>
               <w:jc w:val="left"/>
             </w:pPr>
@@ -9127,6 +9261,7 @@
           </w:tcPr>
           <w:p>
             <w:pPr>
+              <w:keepNext/>
               <w:spacing w:after="0" w:before="0"/>
               <w:jc w:val="right"/>
             </w:pPr>
@@ -9161,6 +9296,7 @@
           </w:tcPr>
           <w:p>
             <w:pPr>
+              <w:keepNext/>
               <w:spacing w:after="0" w:before="0"/>
               <w:jc w:val="right"/>
             </w:pPr>
@@ -9195,6 +9331,7 @@
           </w:tcPr>
           <w:p>
             <w:pPr>
+              <w:keepNext/>
               <w:spacing w:after="0" w:before="0"/>
               <w:jc w:val="right"/>
             </w:pPr>
@@ -9234,6 +9371,7 @@
           </w:tcPr>
           <w:p>
             <w:pPr>
+              <w:keepNext/>
               <w:spacing w:after="0" w:before="0"/>
               <w:jc w:val="left"/>
             </w:pPr>
@@ -9268,6 +9406,7 @@
           </w:tcPr>
           <w:p>
             <w:pPr>
+              <w:keepNext/>
               <w:spacing w:after="0" w:before="0"/>
               <w:jc w:val="right"/>
             </w:pPr>
@@ -9302,6 +9441,7 @@
           </w:tcPr>
           <w:p>
             <w:pPr>
+              <w:keepNext/>
               <w:spacing w:after="0" w:before="0"/>
               <w:jc w:val="right"/>
             </w:pPr>
@@ -9336,6 +9476,7 @@
           </w:tcPr>
           <w:p>
             <w:pPr>
+              <w:keepNext/>
               <w:spacing w:after="0" w:before="0"/>
               <w:jc w:val="right"/>
             </w:pPr>
@@ -9567,6 +9708,7 @@
           </w:tcPr>
           <w:p>
             <w:pPr>
+              <w:keepNext/>
               <w:spacing w:after="0" w:before="0"/>
               <w:jc w:val="left"/>
             </w:pPr>
@@ -9602,6 +9744,7 @@
           </w:tcPr>
           <w:p>
             <w:pPr>
+              <w:keepNext/>
               <w:spacing w:after="0" w:before="0"/>
               <w:jc w:val="right"/>
             </w:pPr>
@@ -9637,6 +9780,7 @@
           </w:tcPr>
           <w:p>
             <w:pPr>
+              <w:keepNext/>
               <w:spacing w:after="0" w:before="0"/>
               <w:jc w:val="left"/>
             </w:pPr>
@@ -9672,6 +9816,7 @@
           </w:tcPr>
           <w:p>
             <w:pPr>
+              <w:keepNext/>
               <w:spacing w:after="0" w:before="0"/>
               <w:jc w:val="left"/>
             </w:pPr>
@@ -9711,6 +9856,7 @@
           </w:tcPr>
           <w:p>
             <w:pPr>
+              <w:keepNext/>
               <w:spacing w:after="0" w:before="0"/>
               <w:jc w:val="left"/>
             </w:pPr>
@@ -9745,6 +9891,7 @@
           </w:tcPr>
           <w:p>
             <w:pPr>
+              <w:keepNext/>
               <w:spacing w:after="0" w:before="0"/>
               <w:jc w:val="right"/>
             </w:pPr>
@@ -9779,6 +9926,7 @@
           </w:tcPr>
           <w:p>
             <w:pPr>
+              <w:keepNext/>
               <w:spacing w:after="0" w:before="0"/>
               <w:jc w:val="left"/>
             </w:pPr>
@@ -9813,6 +9961,7 @@
           </w:tcPr>
           <w:p>
             <w:pPr>
+              <w:keepNext/>
               <w:spacing w:after="0" w:before="0"/>
               <w:jc w:val="left"/>
             </w:pPr>
@@ -9852,6 +10001,7 @@
           </w:tcPr>
           <w:p>
             <w:pPr>
+              <w:keepNext/>
               <w:spacing w:after="0" w:before="0"/>
               <w:jc w:val="left"/>
             </w:pPr>
@@ -9886,6 +10036,7 @@
           </w:tcPr>
           <w:p>
             <w:pPr>
+              <w:keepNext/>
               <w:spacing w:after="0" w:before="0"/>
               <w:jc w:val="right"/>
             </w:pPr>
@@ -9920,6 +10071,7 @@
           </w:tcPr>
           <w:p>
             <w:pPr>
+              <w:keepNext/>
               <w:spacing w:after="0" w:before="0"/>
               <w:jc w:val="left"/>
             </w:pPr>
@@ -9954,6 +10106,7 @@
           </w:tcPr>
           <w:p>
             <w:pPr>
+              <w:keepNext/>
               <w:spacing w:after="0" w:before="0"/>
               <w:jc w:val="left"/>
             </w:pPr>
@@ -9993,6 +10146,7 @@
           </w:tcPr>
           <w:p>
             <w:pPr>
+              <w:keepNext/>
               <w:spacing w:after="0" w:before="0"/>
               <w:jc w:val="left"/>
             </w:pPr>
@@ -10027,6 +10181,7 @@
           </w:tcPr>
           <w:p>
             <w:pPr>
+              <w:keepNext/>
               <w:spacing w:after="0" w:before="0"/>
               <w:jc w:val="right"/>
             </w:pPr>
@@ -10061,6 +10216,7 @@
           </w:tcPr>
           <w:p>
             <w:pPr>
+              <w:keepNext/>
               <w:spacing w:after="0" w:before="0"/>
               <w:jc w:val="left"/>
             </w:pPr>
@@ -10095,6 +10251,7 @@
           </w:tcPr>
           <w:p>
             <w:pPr>
+              <w:keepNext/>
               <w:spacing w:after="0" w:before="0"/>
               <w:jc w:val="left"/>
             </w:pPr>
@@ -10351,6 +10508,7 @@
           </w:tcPr>
           <w:p>
             <w:pPr>
+              <w:keepNext/>
               <w:spacing w:after="0" w:before="0"/>
               <w:jc w:val="left"/>
             </w:pPr>
@@ -10386,6 +10544,7 @@
           </w:tcPr>
           <w:p>
             <w:pPr>
+              <w:keepNext/>
               <w:spacing w:after="0" w:before="0"/>
               <w:jc w:val="left"/>
             </w:pPr>
@@ -10421,6 +10580,7 @@
           </w:tcPr>
           <w:p>
             <w:pPr>
+              <w:keepNext/>
               <w:spacing w:after="0" w:before="0"/>
               <w:jc w:val="right"/>
             </w:pPr>
@@ -10456,6 +10616,7 @@
           </w:tcPr>
           <w:p>
             <w:pPr>
+              <w:keepNext/>
               <w:spacing w:after="0" w:before="0"/>
               <w:jc w:val="right"/>
             </w:pPr>
@@ -10491,6 +10652,7 @@
           </w:tcPr>
           <w:p>
             <w:pPr>
+              <w:keepNext/>
               <w:spacing w:after="0" w:before="0"/>
               <w:jc w:val="left"/>
             </w:pPr>
@@ -10526,6 +10688,7 @@
           </w:tcPr>
           <w:p>
             <w:pPr>
+              <w:keepNext/>
               <w:spacing w:after="0" w:before="0"/>
               <w:jc w:val="left"/>
             </w:pPr>
@@ -10561,6 +10724,7 @@
           </w:tcPr>
           <w:p>
             <w:pPr>
+              <w:keepNext/>
               <w:spacing w:after="0" w:before="0"/>
               <w:jc w:val="right"/>
             </w:pPr>
@@ -10600,6 +10764,7 @@
           </w:tcPr>
           <w:p>
             <w:pPr>
+              <w:keepNext/>
               <w:spacing w:after="0" w:before="0"/>
               <w:jc w:val="left"/>
             </w:pPr>
@@ -10634,6 +10799,7 @@
           </w:tcPr>
           <w:p>
             <w:pPr>
+              <w:keepNext/>
               <w:spacing w:after="0" w:before="0"/>
               <w:jc w:val="left"/>
             </w:pPr>
@@ -10668,6 +10834,7 @@
           </w:tcPr>
           <w:p>
             <w:pPr>
+              <w:keepNext/>
               <w:spacing w:after="0" w:before="0"/>
               <w:jc w:val="right"/>
             </w:pPr>
@@ -10702,6 +10869,7 @@
           </w:tcPr>
           <w:p>
             <w:pPr>
+              <w:keepNext/>
               <w:spacing w:after="0" w:before="0"/>
               <w:jc w:val="right"/>
             </w:pPr>
@@ -10736,6 +10904,7 @@
           </w:tcPr>
           <w:p>
             <w:pPr>
+              <w:keepNext/>
               <w:spacing w:after="0" w:before="0"/>
               <w:jc w:val="left"/>
             </w:pPr>
@@ -10770,6 +10939,7 @@
           </w:tcPr>
           <w:p>
             <w:pPr>
+              <w:keepNext/>
               <w:spacing w:after="0" w:before="0"/>
               <w:jc w:val="left"/>
             </w:pPr>
@@ -10804,6 +10974,7 @@
           </w:tcPr>
           <w:p>
             <w:pPr>
+              <w:keepNext/>
               <w:spacing w:after="0" w:before="0"/>
               <w:jc w:val="right"/>
             </w:pPr>
@@ -10843,6 +11014,7 @@
           </w:tcPr>
           <w:p>
             <w:pPr>
+              <w:keepNext/>
               <w:spacing w:after="0" w:before="0"/>
               <w:jc w:val="left"/>
             </w:pPr>
@@ -10877,6 +11049,7 @@
           </w:tcPr>
           <w:p>
             <w:pPr>
+              <w:keepNext/>
               <w:spacing w:after="0" w:before="0"/>
               <w:jc w:val="left"/>
             </w:pPr>
@@ -10911,6 +11084,7 @@
           </w:tcPr>
           <w:p>
             <w:pPr>
+              <w:keepNext/>
               <w:spacing w:after="0" w:before="0"/>
               <w:jc w:val="right"/>
             </w:pPr>
@@ -10945,6 +11119,7 @@
           </w:tcPr>
           <w:p>
             <w:pPr>
+              <w:keepNext/>
               <w:spacing w:after="0" w:before="0"/>
               <w:jc w:val="right"/>
             </w:pPr>
@@ -10979,6 +11154,7 @@
           </w:tcPr>
           <w:p>
             <w:pPr>
+              <w:keepNext/>
               <w:spacing w:after="0" w:before="0"/>
               <w:jc w:val="left"/>
             </w:pPr>
@@ -11013,6 +11189,7 @@
           </w:tcPr>
           <w:p>
             <w:pPr>
+              <w:keepNext/>
               <w:spacing w:after="0" w:before="0"/>
               <w:jc w:val="left"/>
             </w:pPr>
@@ -11047,6 +11224,7 @@
           </w:tcPr>
           <w:p>
             <w:pPr>
+              <w:keepNext/>
               <w:spacing w:after="0" w:before="0"/>
               <w:jc w:val="right"/>
             </w:pPr>
@@ -11086,6 +11264,7 @@
           </w:tcPr>
           <w:p>
             <w:pPr>
+              <w:keepNext/>
               <w:spacing w:after="0" w:before="0"/>
               <w:jc w:val="left"/>
             </w:pPr>
@@ -11120,6 +11299,7 @@
           </w:tcPr>
           <w:p>
             <w:pPr>
+              <w:keepNext/>
               <w:spacing w:after="0" w:before="0"/>
               <w:jc w:val="left"/>
             </w:pPr>
@@ -11154,6 +11334,7 @@
           </w:tcPr>
           <w:p>
             <w:pPr>
+              <w:keepNext/>
               <w:spacing w:after="0" w:before="0"/>
               <w:jc w:val="right"/>
             </w:pPr>
@@ -11188,6 +11369,7 @@
           </w:tcPr>
           <w:p>
             <w:pPr>
+              <w:keepNext/>
               <w:spacing w:after="0" w:before="0"/>
               <w:jc w:val="right"/>
             </w:pPr>
@@ -11222,6 +11404,7 @@
           </w:tcPr>
           <w:p>
             <w:pPr>
+              <w:keepNext/>
               <w:spacing w:after="0" w:before="0"/>
               <w:jc w:val="left"/>
             </w:pPr>
@@ -11256,6 +11439,7 @@
           </w:tcPr>
           <w:p>
             <w:pPr>
+              <w:keepNext/>
               <w:spacing w:after="0" w:before="0"/>
               <w:jc w:val="left"/>
             </w:pPr>
@@ -11290,6 +11474,7 @@
           </w:tcPr>
           <w:p>
             <w:pPr>
+              <w:keepNext/>
               <w:spacing w:after="0" w:before="0"/>
               <w:jc w:val="right"/>
             </w:pPr>
@@ -12012,6 +12197,7 @@
           </w:tcPr>
           <w:p>
             <w:pPr>
+              <w:keepNext/>
               <w:spacing w:after="0" w:before="0"/>
               <w:jc w:val="center"/>
             </w:pPr>
@@ -12047,6 +12233,7 @@
           </w:tcPr>
           <w:p>
             <w:pPr>
+              <w:keepNext/>
               <w:spacing w:after="0" w:before="0"/>
               <w:jc w:val="left"/>
             </w:pPr>
@@ -12082,6 +12269,7 @@
           </w:tcPr>
           <w:p>
             <w:pPr>
+              <w:keepNext/>
               <w:spacing w:after="0" w:before="0"/>
               <w:jc w:val="left"/>
             </w:pPr>
@@ -12117,6 +12305,7 @@
           </w:tcPr>
           <w:p>
             <w:pPr>
+              <w:keepNext/>
               <w:spacing w:after="0" w:before="0"/>
               <w:jc w:val="center"/>
             </w:pPr>
@@ -12156,6 +12345,7 @@
           </w:tcPr>
           <w:p>
             <w:pPr>
+              <w:keepNext/>
               <w:spacing w:after="0" w:before="0"/>
               <w:jc w:val="center"/>
             </w:pPr>
@@ -12190,6 +12380,7 @@
           </w:tcPr>
           <w:p>
             <w:pPr>
+              <w:keepNext/>
               <w:spacing w:after="0" w:before="0"/>
               <w:jc w:val="left"/>
             </w:pPr>
@@ -12224,6 +12415,7 @@
           </w:tcPr>
           <w:p>
             <w:pPr>
+              <w:keepNext/>
               <w:spacing w:after="0" w:before="0"/>
               <w:jc w:val="left"/>
             </w:pPr>
@@ -12258,6 +12450,7 @@
           </w:tcPr>
           <w:p>
             <w:pPr>
+              <w:keepNext/>
               <w:spacing w:after="0" w:before="0"/>
               <w:jc w:val="center"/>
             </w:pPr>
@@ -12297,6 +12490,7 @@
           </w:tcPr>
           <w:p>
             <w:pPr>
+              <w:keepNext/>
               <w:spacing w:after="0" w:before="0"/>
               <w:jc w:val="center"/>
             </w:pPr>
@@ -12331,6 +12525,7 @@
           </w:tcPr>
           <w:p>
             <w:pPr>
+              <w:keepNext/>
               <w:spacing w:after="0" w:before="0"/>
               <w:jc w:val="left"/>
             </w:pPr>
@@ -12365,6 +12560,7 @@
           </w:tcPr>
           <w:p>
             <w:pPr>
+              <w:keepNext/>
               <w:spacing w:after="0" w:before="0"/>
               <w:jc w:val="left"/>
             </w:pPr>
@@ -12399,6 +12595,7 @@
           </w:tcPr>
           <w:p>
             <w:pPr>
+              <w:keepNext/>
               <w:spacing w:after="0" w:before="0"/>
               <w:jc w:val="center"/>
             </w:pPr>
@@ -12614,6 +12811,7 @@
           </w:tcPr>
           <w:p>
             <w:pPr>
+              <w:keepNext/>
               <w:spacing w:after="0" w:before="0"/>
               <w:jc w:val="center"/>
             </w:pPr>
@@ -12649,6 +12847,7 @@
           </w:tcPr>
           <w:p>
             <w:pPr>
+              <w:keepNext/>
               <w:spacing w:after="0" w:before="0"/>
               <w:jc w:val="left"/>
             </w:pPr>
@@ -12684,6 +12883,7 @@
           </w:tcPr>
           <w:p>
             <w:pPr>
+              <w:keepNext/>
               <w:spacing w:after="0" w:before="0"/>
               <w:jc w:val="left"/>
             </w:pPr>
@@ -12719,6 +12919,7 @@
           </w:tcPr>
           <w:p>
             <w:pPr>
+              <w:keepNext/>
               <w:spacing w:after="0" w:before="0"/>
               <w:jc w:val="left"/>
             </w:pPr>
@@ -12754,6 +12955,7 @@
           </w:tcPr>
           <w:p>
             <w:pPr>
+              <w:keepNext/>
               <w:spacing w:after="0" w:before="0"/>
               <w:jc w:val="left"/>
             </w:pPr>
@@ -12793,6 +12995,7 @@
           </w:tcPr>
           <w:p>
             <w:pPr>
+              <w:keepNext/>
               <w:spacing w:after="0" w:before="0"/>
               <w:jc w:val="center"/>
             </w:pPr>
@@ -12827,6 +13030,7 @@
           </w:tcPr>
           <w:p>
             <w:pPr>
+              <w:keepNext/>
               <w:spacing w:after="0" w:before="0"/>
               <w:jc w:val="left"/>
             </w:pPr>
@@ -12861,6 +13065,7 @@
           </w:tcPr>
           <w:p>
             <w:pPr>
+              <w:keepNext/>
               <w:spacing w:after="0" w:before="0"/>
               <w:jc w:val="left"/>
             </w:pPr>
@@ -12895,6 +13100,7 @@
           </w:tcPr>
           <w:p>
             <w:pPr>
+              <w:keepNext/>
               <w:spacing w:after="0" w:before="0"/>
               <w:jc w:val="left"/>
             </w:pPr>
@@ -12929,6 +13135,7 @@
           </w:tcPr>
           <w:p>
             <w:pPr>
+              <w:keepNext/>
               <w:spacing w:after="0" w:before="0"/>
               <w:jc w:val="left"/>
             </w:pPr>
@@ -12968,6 +13175,7 @@
           </w:tcPr>
           <w:p>
             <w:pPr>
+              <w:keepNext/>
               <w:spacing w:after="0" w:before="0"/>
               <w:jc w:val="center"/>
             </w:pPr>
@@ -13002,6 +13210,7 @@
           </w:tcPr>
           <w:p>
             <w:pPr>
+              <w:keepNext/>
               <w:spacing w:after="0" w:before="0"/>
               <w:jc w:val="left"/>
             </w:pPr>
@@ -13036,6 +13245,7 @@
           </w:tcPr>
           <w:p>
             <w:pPr>
+              <w:keepNext/>
               <w:spacing w:after="0" w:before="0"/>
               <w:jc w:val="left"/>
             </w:pPr>
@@ -13070,6 +13280,7 @@
           </w:tcPr>
           <w:p>
             <w:pPr>
+              <w:keepNext/>
               <w:spacing w:after="0" w:before="0"/>
               <w:jc w:val="left"/>
             </w:pPr>
@@ -13104,6 +13315,7 @@
           </w:tcPr>
           <w:p>
             <w:pPr>
+              <w:keepNext/>
               <w:spacing w:after="0" w:before="0"/>
               <w:jc w:val="left"/>
             </w:pPr>
@@ -13143,6 +13355,7 @@
           </w:tcPr>
           <w:p>
             <w:pPr>
+              <w:keepNext/>
               <w:spacing w:after="0" w:before="0"/>
               <w:jc w:val="center"/>
             </w:pPr>
@@ -13177,6 +13390,7 @@
           </w:tcPr>
           <w:p>
             <w:pPr>
+              <w:keepNext/>
               <w:spacing w:after="0" w:before="0"/>
               <w:jc w:val="left"/>
             </w:pPr>
@@ -13211,6 +13425,7 @@
           </w:tcPr>
           <w:p>
             <w:pPr>
+              <w:keepNext/>
               <w:spacing w:after="0" w:before="0"/>
               <w:jc w:val="left"/>
             </w:pPr>
@@ -13245,6 +13460,7 @@
           </w:tcPr>
           <w:p>
             <w:pPr>
+              <w:keepNext/>
               <w:spacing w:after="0" w:before="0"/>
               <w:jc w:val="left"/>
             </w:pPr>
@@ -13279,6 +13495,7 @@
           </w:tcPr>
           <w:p>
             <w:pPr>
+              <w:keepNext/>
               <w:spacing w:after="0" w:before="0"/>
               <w:jc w:val="left"/>
             </w:pPr>

</xml_diff>